<commit_message>
Resume consistency audit and updates
Add RESUME_AUDIT_2026-07.md documenting a consistency audit and apply corrections across all eight generated resume variants (resume_fulltime_dev(.docx/.de), resume_fulltime_pm(.docx/.de), resume_werk_dev(.docx/.de), resume_werk_pm(.docx/.de)). Removes overclaims (leadership, Fortune 500, region errors), softens technical ownership, normalizes languages/availability/relocation, fixes formatting/bolding/grammar, harmonizes website links and date formats, and standardizes role titles. Note: a temporary Office lock file (~$sume_werk_pm.docx) is present in the changeset.
</commit_message>
<xml_diff>
--- a/resume_fulltime_dev.docx
+++ b/resume_fulltime_dev.docx
@@ -32,7 +32,7 @@
           <w:sz w:val="19"/>
           <w:szCs w:val="19"/>
         </w:rPr>
-        <w:t xml:space="preserve">Aachen, Germany  •  +49 152 07480366  •  </w:t>
+        <w:t xml:space="preserve">Aachen, Germany (open to relocation within Germany)  •  +49 152 07480366  •  </w:t>
       </w:r>
       <w:hyperlink r:id="rId7" w:history="1">
         <w:r>
@@ -80,7 +80,7 @@
             <w:szCs w:val="19"/>
             <w:u w:val="single"/>
           </w:rPr>
-          <w:t>Website</w:t>
+          <w:t>vishalmaheshkumar.com</w:t>
         </w:r>
       </w:hyperlink>
     </w:p>
@@ -107,47 +107,53 @@
         <w:spacing w:after="60" w:line="260" w:lineRule="auto"/>
         <w:jc w:val="both"/>
       </w:pPr>
-      <w:r>
-        <w:t>ServiceNow Developer and full-stack engineer with ~3 years of production experience at Flexera (US enterprise software). Specialized in ITAM, CMDB integrations, REST/</w:t>
-      </w:r>
       <w:proofErr w:type="spellStart"/>
-      <w:r>
-        <w:t>GraphQL</w:t>
-      </w:r>
       <w:proofErr w:type="spellEnd"/>
-      <w:r>
-        <w:t xml:space="preserve"> APIs, and AWS-based ETL platforms serving global enterprise customers. Independent builder shipping AI-native products (</w:t>
-      </w:r>
       <w:proofErr w:type="spellStart"/>
-      <w:r>
-        <w:t>Wolflayer</w:t>
-      </w:r>
       <w:proofErr w:type="spellEnd"/>
-      <w:r>
-        <w:t xml:space="preserve">) end-to-end on Next.js, </w:t>
-      </w:r>
       <w:proofErr w:type="spellStart"/>
-      <w:r>
-        <w:t>Supabase</w:t>
-      </w:r>
       <w:proofErr w:type="spellEnd"/>
       <w:r>
-        <w:t xml:space="preserve">, and Google Gemini. Currently completing an M.Sc. Management &amp; Engineering at RWTH Aachen; available for full-time engineering roles from </w:t>
-      </w:r>
-      <w:r>
-        <w:t>September 2026</w:t>
-      </w:r>
-      <w:r>
-        <w:t xml:space="preserve">, with option to switch program to </w:t>
-      </w:r>
-      <w:r>
-        <w:t xml:space="preserve">my course </w:t>
-      </w:r>
-      <w:r>
-        <w:t>part-time</w:t>
-      </w:r>
-      <w:r>
-        <w:t xml:space="preserve">. </w:t>
+        <w:rPr>
+          <w:b w:val="0"/>
+        </w:rPr>
+        <w:t xml:space="preserve">ServiceNow developer and full-stack engineer. </w:t>
+      </w:r>
+      <w:r>
+        <w:rPr>
+          <w:b/>
+        </w:rPr>
+        <w:t>Three years at Flexera</w:t>
+      </w:r>
+      <w:r>
+        <w:rPr>
+          <w:b w:val="0"/>
+        </w:rPr>
+        <w:t xml:space="preserve"> building ITAM and CMDB integrations, REST and GraphQL APIs, and AWS data pipelines for large enterprise customers. Built and now run Wolflayer, an AI product on Next.js, Supabase and Google Gemini, on my own. Finishing an M.Sc. Management &amp; Engineering at RWTH Aachen. </w:t>
+      </w:r>
+      <w:r>
+        <w:rPr>
+          <w:b/>
+        </w:rPr>
+        <w:t>Available full-time from September 2026</w:t>
+      </w:r>
+      <w:r>
+        <w:rPr>
+          <w:b w:val="0"/>
+        </w:rPr>
+        <w:t xml:space="preserve"> and able to switch the M.Sc. to part-time for the right role. </w:t>
+      </w:r>
+      <w:r>
+        <w:rPr>
+          <w:b/>
+        </w:rPr>
+        <w:t>Open to relocating anywhere in Germany</w:t>
+      </w:r>
+      <w:r>
+        <w:rPr>
+          <w:b w:val="0"/>
+        </w:rPr>
+        <w:t>.</w:t>
       </w:r>
     </w:p>
     <w:p>
@@ -308,6 +314,28 @@
         <w:t>LiteLLM</w:t>
       </w:r>
       <w:proofErr w:type="spellEnd"/>
+    </w:p>
+    <w:p>
+      <w:pPr>
+        <w:spacing w:after="40" w:line="260" w:lineRule="auto"/>
+        <w:jc w:val="both"/>
+      </w:pPr>
+      <w:proofErr w:type="spellStart"/>
+      <w:proofErr w:type="spellEnd"/>
+      <w:r>
+        <w:rPr>
+          <w:b/>
+          <w:bCs/>
+        </w:rPr>
+        <w:t>Languages:</w:t>
+      </w:r>
+      <w:r>
+        <w:rPr>
+          <w:b w:val="0"/>
+          <w:bCs/>
+        </w:rPr>
+        <w:t xml:space="preserve"> English (business fluent, working language); German (A1, actively learning); Hindi and Kannada (fluent)</w:t>
+      </w:r>
     </w:p>
     <w:p>
       <w:pPr>
@@ -389,7 +417,40 @@
         <w:jc w:val="both"/>
       </w:pPr>
       <w:r>
-        <w:t>Led migration of ETL functionality from ServiceNow to AWS, redesigning platform architecture and improving customer-end performance by ~60%.</w:t>
+        <w:rPr>
+          <w:b/>
+        </w:rPr>
+        <w:t>Core contributor</w:t>
+      </w:r>
+      <w:r>
+        <w:rPr>
+          <w:b w:val="0"/>
+        </w:rPr>
+        <w:t xml:space="preserve"> to migrating ETL functionality from </w:t>
+      </w:r>
+      <w:r>
+        <w:rPr>
+          <w:b/>
+        </w:rPr>
+        <w:t>ServiceNow to AWS</w:t>
+      </w:r>
+      <w:r>
+        <w:rPr>
+          <w:b w:val="0"/>
+        </w:rPr>
+        <w:t xml:space="preserve"> as part of a platform re-architecture, reducing customer-side processing load and improving end-customer performance by </w:t>
+      </w:r>
+      <w:r>
+        <w:rPr>
+          <w:b/>
+        </w:rPr>
+        <w:t>~60%</w:t>
+      </w:r>
+      <w:r>
+        <w:rPr>
+          <w:b w:val="0"/>
+        </w:rPr>
+        <w:t>.</w:t>
       </w:r>
     </w:p>
     <w:p>
@@ -403,7 +464,28 @@
         <w:jc w:val="both"/>
       </w:pPr>
       <w:r>
-        <w:t>Designed and enhanced Robust Transform Engine (RTE) pipelines for enterprise hardware and software inventory ingestion at scale.</w:t>
+        <w:rPr>
+          <w:b/>
+        </w:rPr>
+        <w:t>Designed and enhanced</w:t>
+      </w:r>
+      <w:r>
+        <w:rPr>
+          <w:b w:val="0"/>
+        </w:rPr>
+        <w:t xml:space="preserve"> </w:t>
+      </w:r>
+      <w:r>
+        <w:rPr>
+          <w:b/>
+        </w:rPr>
+        <w:t>Robust Transform Engine (RTE)</w:t>
+      </w:r>
+      <w:r>
+        <w:rPr>
+          <w:b w:val="0"/>
+        </w:rPr>
+        <w:t xml:space="preserve"> pipelines for enterprise hardware and software inventory ingestion.</w:t>
       </w:r>
     </w:p>
     <w:p>
@@ -417,7 +499,28 @@
         <w:jc w:val="both"/>
       </w:pPr>
       <w:r>
-        <w:t>Built MCP-compatible backend services using OpenAI Model Context Protocol for AI-assisted enterprise workflows.</w:t>
+        <w:rPr>
+          <w:b/>
+        </w:rPr>
+        <w:t>Built</w:t>
+      </w:r>
+      <w:r>
+        <w:rPr>
+          <w:b w:val="0"/>
+        </w:rPr>
+        <w:t xml:space="preserve"> MCP-compatible backend services using </w:t>
+      </w:r>
+      <w:r>
+        <w:rPr>
+          <w:b/>
+        </w:rPr>
+        <w:t>OpenAI Model Context Protocol</w:t>
+      </w:r>
+      <w:r>
+        <w:rPr>
+          <w:b w:val="0"/>
+        </w:rPr>
+        <w:t xml:space="preserve"> for AI-assisted enterprise workflows.</w:t>
       </w:r>
     </w:p>
     <w:p>
@@ -430,15 +533,42 @@
         <w:spacing w:after="40" w:line="260" w:lineRule="auto"/>
         <w:jc w:val="both"/>
       </w:pPr>
-      <w:r>
-        <w:t xml:space="preserve">Designed SMART REST APIs with pagination and structured response headers for large enterprise datasets; introduced </w:t>
-      </w:r>
       <w:proofErr w:type="spellStart"/>
-      <w:r>
+      <w:proofErr w:type="spellEnd"/>
+      <w:r>
+        <w:rPr>
+          <w:b/>
+        </w:rPr>
+        <w:t>Designed</w:t>
+      </w:r>
+      <w:r>
+        <w:rPr>
+          <w:b w:val="0"/>
+        </w:rPr>
+        <w:t xml:space="preserve"> </w:t>
+      </w:r>
+      <w:r>
+        <w:rPr>
+          <w:b/>
+        </w:rPr>
+        <w:t>SMART REST APIs</w:t>
+      </w:r>
+      <w:r>
+        <w:rPr>
+          <w:b w:val="0"/>
+        </w:rPr>
+        <w:t xml:space="preserve"> with pagination and structured response headers for large enterprise datasets; introduced </w:t>
+      </w:r>
+      <w:r>
+        <w:rPr>
+          <w:b/>
+        </w:rPr>
         <w:t>GraphQL</w:t>
       </w:r>
-      <w:proofErr w:type="spellEnd"/>
-      <w:r>
+      <w:r>
+        <w:rPr>
+          <w:b w:val="0"/>
+        </w:rPr>
         <w:t xml:space="preserve"> endpoints to reduce client-side over-fetching.</w:t>
       </w:r>
     </w:p>
@@ -453,7 +583,28 @@
         <w:jc w:val="both"/>
       </w:pPr>
       <w:r>
-        <w:t>Implemented rule-based classification logic for Hardware Category, OS Category, and Subcategories driving structured CMDB mapping.</w:t>
+        <w:rPr>
+          <w:b/>
+        </w:rPr>
+        <w:t>Implemented</w:t>
+      </w:r>
+      <w:r>
+        <w:rPr>
+          <w:b w:val="0"/>
+        </w:rPr>
+        <w:t xml:space="preserve"> rule-based classification logic for Hardware Category, OS Category, and Subcategories used for </w:t>
+      </w:r>
+      <w:r>
+        <w:rPr>
+          <w:b/>
+        </w:rPr>
+        <w:t>CMDB</w:t>
+      </w:r>
+      <w:r>
+        <w:rPr>
+          <w:b w:val="0"/>
+        </w:rPr>
+        <w:t xml:space="preserve"> mapping.</w:t>
       </w:r>
     </w:p>
     <w:p>
@@ -467,7 +618,28 @@
         <w:jc w:val="both"/>
       </w:pPr>
       <w:r>
-        <w:t>Processed real-time network adapter events and mapped network interface data into CMDB tables.</w:t>
+        <w:rPr>
+          <w:b/>
+        </w:rPr>
+        <w:t>Processed</w:t>
+      </w:r>
+      <w:r>
+        <w:rPr>
+          <w:b w:val="0"/>
+        </w:rPr>
+        <w:t xml:space="preserve"> real-time network adapter events and mapped network interface data into </w:t>
+      </w:r>
+      <w:r>
+        <w:rPr>
+          <w:b/>
+        </w:rPr>
+        <w:t>CMDB</w:t>
+      </w:r>
+      <w:r>
+        <w:rPr>
+          <w:b w:val="0"/>
+        </w:rPr>
+        <w:t xml:space="preserve"> tables.</w:t>
       </w:r>
     </w:p>
     <w:p>
@@ -532,7 +704,38 @@
         <w:jc w:val="both"/>
       </w:pPr>
       <w:r>
-        <w:t>Built API integration and software inventory ingestion features on Flexera SaaS Manager (MongoDB, PostgreSQL, AWS).</w:t>
+        <w:rPr/>
+        <w:t>Assisted in developing and maintaining</w:t>
+      </w:r>
+      <w:r>
+        <w:rPr>
+          <w:b w:val="0"/>
+        </w:rPr>
+        <w:t xml:space="preserve"> the </w:t>
+      </w:r>
+      <w:r>
+        <w:rPr>
+          <w:b/>
+        </w:rPr>
+        <w:t>Flexera SaaS Manager</w:t>
+      </w:r>
+      <w:r>
+        <w:rPr>
+          <w:b w:val="0"/>
+        </w:rPr>
+        <w:t xml:space="preserve"> SaaS application (</w:t>
+      </w:r>
+      <w:r>
+        <w:rPr>
+          <w:b/>
+        </w:rPr>
+        <w:t>MongoDB, PostgreSQL, AWS S3, CloudWatch</w:t>
+      </w:r>
+      <w:r>
+        <w:rPr>
+          <w:b w:val="0"/>
+        </w:rPr>
+        <w:t>); conducted API research and integration work.</w:t>
       </w:r>
     </w:p>
     <w:p>
@@ -546,7 +749,28 @@
         <w:jc w:val="both"/>
       </w:pPr>
       <w:r>
-        <w:t>Designed reusable Script Includes for validation, CMDB mapping, and API response formatting.</w:t>
+        <w:rPr>
+          <w:b/>
+        </w:rPr>
+        <w:t>Developed</w:t>
+      </w:r>
+      <w:r>
+        <w:rPr>
+          <w:b w:val="0"/>
+        </w:rPr>
+        <w:t xml:space="preserve"> reusable </w:t>
+      </w:r>
+      <w:r>
+        <w:rPr>
+          <w:b/>
+        </w:rPr>
+        <w:t>Script Includes</w:t>
+      </w:r>
+      <w:r>
+        <w:rPr>
+          <w:b w:val="0"/>
+        </w:rPr>
+        <w:t xml:space="preserve"> for validation, CMDB mapping, and API response formatting.</w:t>
       </w:r>
     </w:p>
     <w:p>
@@ -560,7 +784,28 @@
         <w:jc w:val="both"/>
       </w:pPr>
       <w:r>
-        <w:t>Created synchronous and asynchronous Business Rules to enforce data consistency on insert/update.</w:t>
+        <w:rPr>
+          <w:b/>
+        </w:rPr>
+        <w:t>Created</w:t>
+      </w:r>
+      <w:r>
+        <w:rPr>
+          <w:b w:val="0"/>
+        </w:rPr>
+        <w:t xml:space="preserve"> synchronous and asynchronous </w:t>
+      </w:r>
+      <w:r>
+        <w:rPr>
+          <w:b/>
+        </w:rPr>
+        <w:t>Business Rules</w:t>
+      </w:r>
+      <w:r>
+        <w:rPr>
+          <w:b w:val="0"/>
+        </w:rPr>
+        <w:t xml:space="preserve"> to enforce data consistency on insert/update.</w:t>
       </w:r>
     </w:p>
     <w:p>
@@ -574,7 +819,28 @@
         <w:jc w:val="both"/>
       </w:pPr>
       <w:r>
-        <w:t>Awarded Professionalism Badge for cross-functional debugging and technical research contributions.</w:t>
+        <w:rPr>
+          <w:b/>
+        </w:rPr>
+        <w:t>Awarded</w:t>
+      </w:r>
+      <w:r>
+        <w:rPr>
+          <w:b w:val="0"/>
+        </w:rPr>
+        <w:t xml:space="preserve"> </w:t>
+      </w:r>
+      <w:r>
+        <w:rPr>
+          <w:b/>
+        </w:rPr>
+        <w:t>Professionalism Badge</w:t>
+      </w:r>
+      <w:r>
+        <w:rPr>
+          <w:b w:val="0"/>
+        </w:rPr>
+        <w:t xml:space="preserve"> for cross-functional debugging and technical research contributions.</w:t>
       </w:r>
     </w:p>
     <w:p>
@@ -660,7 +926,28 @@
         <w:spacing w:after="40" w:line="260" w:lineRule="auto"/>
       </w:pPr>
       <w:r>
-        <w:t>Developed image processing software for oil rig operations using Python, C++, and OpenCV.</w:t>
+        <w:rPr>
+          <w:b/>
+        </w:rPr>
+        <w:t>Developed</w:t>
+      </w:r>
+      <w:r>
+        <w:rPr>
+          <w:b w:val="0"/>
+        </w:rPr>
+        <w:t xml:space="preserve"> image processing software for oil rig operations using </w:t>
+      </w:r>
+      <w:r>
+        <w:rPr>
+          <w:b/>
+        </w:rPr>
+        <w:t>Python, C++, and OpenCV</w:t>
+      </w:r>
+      <w:r>
+        <w:rPr>
+          <w:b w:val="0"/>
+        </w:rPr>
+        <w:t>.</w:t>
       </w:r>
     </w:p>
     <w:p>
@@ -949,15 +1236,30 @@
         <w:spacing w:after="40" w:line="260" w:lineRule="auto"/>
         <w:jc w:val="both"/>
       </w:pPr>
-      <w:r>
-        <w:t xml:space="preserve">Built and deployed solo: production full-stack platform on Next.js, React, TypeScript, </w:t>
-      </w:r>
       <w:proofErr w:type="spellStart"/>
-      <w:r>
-        <w:t>Supabase</w:t>
-      </w:r>
       <w:proofErr w:type="spellEnd"/>
       <w:r>
+        <w:rPr>
+          <w:b/>
+        </w:rPr>
+        <w:t>Built and deployed solo</w:t>
+      </w:r>
+      <w:r>
+        <w:rPr>
+          <w:b w:val="0"/>
+        </w:rPr>
+        <w:t xml:space="preserve">: production full-stack platform on </w:t>
+      </w:r>
+      <w:r>
+        <w:rPr>
+          <w:b/>
+        </w:rPr>
+        <w:t>Next.js, React, TypeScript, Supabase</w:t>
+      </w:r>
+      <w:r>
+        <w:rPr>
+          <w:b w:val="0"/>
+        </w:rPr>
         <w:t xml:space="preserve"> with role-based access control and OAuth (GitHub, Google).</w:t>
       </w:r>
     </w:p>
@@ -972,7 +1274,40 @@
         <w:jc w:val="both"/>
       </w:pPr>
       <w:r>
-        <w:t>Implemented an AI workspace on Google Gemini and a visual workflow-execution engine, with AES-256-GCM encryption for stored credentials.</w:t>
+        <w:rPr>
+          <w:b/>
+        </w:rPr>
+        <w:t>Implemented</w:t>
+      </w:r>
+      <w:r>
+        <w:rPr>
+          <w:b w:val="0"/>
+        </w:rPr>
+        <w:t xml:space="preserve"> an AI workspace on </w:t>
+      </w:r>
+      <w:r>
+        <w:rPr>
+          <w:b/>
+        </w:rPr>
+        <w:t>Google Gemini</w:t>
+      </w:r>
+      <w:r>
+        <w:rPr>
+          <w:b w:val="0"/>
+        </w:rPr>
+        <w:t xml:space="preserve"> and a visual workflow-execution engine, with </w:t>
+      </w:r>
+      <w:r>
+        <w:rPr>
+          <w:b/>
+        </w:rPr>
+        <w:t>AES-256-GCM</w:t>
+      </w:r>
+      <w:r>
+        <w:rPr>
+          <w:b w:val="0"/>
+        </w:rPr>
+        <w:t xml:space="preserve"> encryption for stored credentials.</w:t>
       </w:r>
     </w:p>
     <w:p>
@@ -985,65 +1320,21 @@
         <w:spacing w:after="40" w:line="260" w:lineRule="auto"/>
         <w:jc w:val="both"/>
       </w:pPr>
-      <w:r>
-        <w:t xml:space="preserve">Designed the </w:t>
-      </w:r>
       <w:proofErr w:type="spellStart"/>
-      <w:r>
-        <w:t>collabo_tree</w:t>
-      </w:r>
       <w:proofErr w:type="spellEnd"/>
-      <w:r>
-        <w:t xml:space="preserve"> </w:t>
-      </w:r>
-      <w:r>
-        <w:t>to</w:t>
-      </w:r>
-      <w:r>
-        <w:t xml:space="preserve"> </w:t>
-      </w:r>
       <w:proofErr w:type="spellStart"/>
-      <w:r>
-        <w:t>collabo_space</w:t>
-      </w:r>
       <w:proofErr w:type="spellEnd"/>
       <w:r>
-        <w:t xml:space="preserve"> bridge connecting multiplayer reasoning to executable workflows.</w:t>
-      </w:r>
-    </w:p>
-    <w:p>
-      <w:pPr>
-        <w:spacing w:before="80" w:after="40" w:line="260" w:lineRule="auto"/>
-      </w:pPr>
-      <w:r>
-        <w:rPr>
-          <w:b/>
-          <w:bCs/>
-          <w:color w:val="1F3864"/>
-          <w:sz w:val="21"/>
-          <w:szCs w:val="21"/>
-        </w:rPr>
-        <w:t xml:space="preserve">Ashwa Racing </w:t>
-      </w:r>
-      <w:r>
-        <w:rPr>
-          <w:b/>
-          <w:bCs/>
-          <w:color w:val="1F3864"/>
-          <w:sz w:val="21"/>
-          <w:szCs w:val="21"/>
-        </w:rPr>
-        <w:t>|</w:t>
-      </w:r>
-      <w:r>
-        <w:rPr>
-          <w:b/>
-          <w:bCs/>
-          <w:color w:val="1F3864"/>
-          <w:sz w:val="21"/>
-          <w:szCs w:val="21"/>
-        </w:rPr>
-        <w:t xml:space="preserve"> Formula Student Hybrid Vehicle</w:t>
+        <w:rPr>
+          <w:b/>
+        </w:rPr>
+        <w:t>Designed</w:t>
+      </w:r>
+      <w:r>
+        <w:rPr>
+          <w:b w:val="0"/>
+        </w:rPr>
+        <w:t xml:space="preserve"> the collabo_tree to collabo_space bridge connecting multiplayer reasoning to executable workflows.</w:t>
       </w:r>
     </w:p>
     <w:p>
@@ -1056,8 +1347,36 @@
         <w:spacing w:after="40" w:line="260" w:lineRule="auto"/>
         <w:jc w:val="both"/>
       </w:pPr>
-      <w:r>
-        <w:t>Designed Vehicle Control Unit (VCU) and Data Acquisition System (DAQ); implemented TI CC1390 wireless MCU for real-time telemetry.</w:t>
+      <w:proofErr w:type="spellStart"/>
+      <w:proofErr w:type="spellEnd"/>
+      <w:proofErr w:type="spellStart"/>
+      <w:proofErr w:type="spellEnd"/>
+      <w:r>
+        <w:rPr>
+          <w:b/>
+        </w:rPr>
+        <w:t>Running</w:t>
+      </w:r>
+      <w:r>
+        <w:rPr>
+          <w:b w:val="0"/>
+        </w:rPr>
+        <w:t xml:space="preserve"> user-testing rounds with early users; currently part of Collective Incubator, Aachen.</w:t>
+      </w:r>
+    </w:p>
+    <w:p>
+      <w:pPr>
+        <w:spacing w:before="80" w:after="40" w:line="260" w:lineRule="auto"/>
+      </w:pPr>
+      <w:r>
+        <w:rPr>
+          <w:b/>
+          <w:bCs/>
+          <w:color w:val="1F3864"/>
+          <w:sz w:val="21"/>
+          <w:szCs w:val="21"/>
+        </w:rPr>
+        <w:t>Ashwa Racing | Formula Student Hybrid Vehicle (2018 – 2022) | Electrical &amp; Testing Subsystem Lead</w:t>
       </w:r>
     </w:p>
     <w:p>
@@ -1071,13 +1390,63 @@
         <w:jc w:val="both"/>
       </w:pPr>
       <w:r>
-        <w:t xml:space="preserve">Led Electrical &amp; Testing subsystem; 1st Place </w:t>
-      </w:r>
-      <w:r>
-        <w:t>|</w:t>
-      </w:r>
-      <w:r>
-        <w:t xml:space="preserve"> Formula Hybrid 2021 (USA, IEEE/Formula Student).</w:t>
+        <w:rPr>
+          <w:b/>
+        </w:rPr>
+        <w:t>Designed</w:t>
+      </w:r>
+      <w:r>
+        <w:rPr>
+          <w:b w:val="0"/>
+        </w:rPr>
+        <w:t xml:space="preserve"> </w:t>
+      </w:r>
+      <w:r>
+        <w:rPr>
+          <w:b/>
+        </w:rPr>
+        <w:t>Vehicle Control Unit (VCU)</w:t>
+      </w:r>
+      <w:r>
+        <w:rPr>
+          <w:b w:val="0"/>
+        </w:rPr>
+        <w:t xml:space="preserve"> and Data Acquisition System (DAQ); programmed the TI CC1390 wireless MCU in C and wrote the custom data-transmission protocol stack for real-time vehicle-to-pit telemetry.</w:t>
+      </w:r>
+    </w:p>
+    <w:p>
+      <w:pPr>
+        <w:pStyle w:val="ListParagraph"/>
+        <w:numPr>
+          <w:ilvl w:val="0"/>
+          <w:numId w:val="2"/>
+        </w:numPr>
+        <w:spacing w:after="40" w:line="260" w:lineRule="auto"/>
+        <w:jc w:val="both"/>
+      </w:pPr>
+      <w:r>
+        <w:rPr>
+          <w:b/>
+        </w:rPr>
+        <w:t>Led</w:t>
+      </w:r>
+      <w:r>
+        <w:rPr>
+          <w:b w:val="0"/>
+        </w:rPr>
+        <w:t xml:space="preserve"> Electrical &amp; Testing subsystem; </w:t>
+      </w:r>
+      <w:r>
+        <w:rPr>
+          <w:b/>
+        </w:rPr>
+        <w:t>1st Place</w:t>
+      </w:r>
+      <w:r>
+        <w:rPr>
+          <w:b w:val="0"/>
+        </w:rPr>
+        <w:t xml:space="preserve"> | Formula Hybrid 2021 (USA, IEEE/Formula Student).</w:t>
       </w:r>
     </w:p>
     <w:p>
@@ -1092,27 +1461,7 @@
           <w:sz w:val="21"/>
           <w:szCs w:val="21"/>
         </w:rPr>
-        <w:t>TÜV SÜD</w:t>
-      </w:r>
-      <w:r>
-        <w:rPr>
-          <w:b/>
-          <w:bCs/>
-          <w:color w:val="1F3864"/>
-          <w:sz w:val="21"/>
-          <w:szCs w:val="21"/>
-        </w:rPr>
-        <w:t>:</w:t>
-      </w:r>
-      <w:r>
-        <w:rPr>
-          <w:b/>
-          <w:bCs/>
-          <w:color w:val="1F3864"/>
-          <w:sz w:val="21"/>
-          <w:szCs w:val="21"/>
-        </w:rPr>
-        <w:t xml:space="preserve"> Capability-to-Account Mapping Assistant (RWTH Service Innovation Lab)</w:t>
+        <w:t>Consultant – Applied AI (Artificial Intelligence) for Key Account Management  ||  TÜV SÜD (via RWTH Service Innovation Lab)</w:t>
       </w:r>
     </w:p>
     <w:p>
@@ -1131,8 +1480,44 @@
       <w:r>
         <w:rPr>
           <w:rFonts w:eastAsia="Times New Roman"/>
-        </w:rPr>
-        <w:t xml:space="preserve">Led 5-person team advising TÜV SÜD's KAM organization (~150 KAMs, ~20% of customer base); scoped 5 AI use cases across the account lifecycle and recommended a RAG-based Capability-to-Account Mapping Assistant on Dynamics 365 + SharePoint + Azure OpenAI, projected to cut account-planning cycle from 2–5 days to &lt;1 day. </w:t>
+          <w:b/>
+        </w:rPr>
+        <w:t>Led a 5-person team</w:t>
+      </w:r>
+      <w:r>
+        <w:rPr>
+          <w:rFonts w:eastAsia="Times New Roman"/>
+          <w:b w:val="0"/>
+        </w:rPr>
+        <w:t xml:space="preserve"> advising TÜV SÜD's Key Account Management organization (</w:t>
+      </w:r>
+      <w:r>
+        <w:rPr>
+          <w:rFonts w:eastAsia="Times New Roman"/>
+          <w:b/>
+        </w:rPr>
+        <w:t>~150 KAMs</w:t>
+      </w:r>
+      <w:r>
+        <w:rPr>
+          <w:rFonts w:eastAsia="Times New Roman"/>
+          <w:b w:val="0"/>
+        </w:rPr>
+        <w:t xml:space="preserve">, ~20% of the customer base); scoped </w:t>
+      </w:r>
+      <w:r>
+        <w:rPr>
+          <w:rFonts w:eastAsia="Times New Roman"/>
+          <w:b/>
+        </w:rPr>
+        <w:t>5 AI use cases</w:t>
+      </w:r>
+      <w:r>
+        <w:rPr>
+          <w:rFonts w:eastAsia="Times New Roman"/>
+          <w:b w:val="0"/>
+        </w:rPr>
+        <w:t xml:space="preserve"> across the account lifecycle.</w:t>
       </w:r>
     </w:p>
     <w:p>
@@ -1151,8 +1536,44 @@
       <w:r>
         <w:rPr>
           <w:rFonts w:eastAsia="Times New Roman"/>
-        </w:rPr>
-        <w:t>Designed 4-pillar enterprise architecture (Data · Tech · Org · Governance) in draw.io and pitched the 9-month pilot roadmap to TÜV SÜD KAM leadership.</w:t>
+          <w:b/>
+        </w:rPr>
+        <w:t>Designed</w:t>
+      </w:r>
+      <w:r>
+        <w:rPr>
+          <w:rFonts w:eastAsia="Times New Roman"/>
+          <w:b w:val="0"/>
+        </w:rPr>
+        <w:t xml:space="preserve"> a 4-pillar target architecture (Data · Tech · Org · Governance) for a RAG-based Capability-to-Account Mapping Assistant on </w:t>
+      </w:r>
+      <w:r>
+        <w:rPr>
+          <w:rFonts w:eastAsia="Times New Roman"/>
+          <w:b/>
+        </w:rPr>
+        <w:t>Dynamics 365</w:t>
+      </w:r>
+      <w:r>
+        <w:rPr>
+          <w:rFonts w:eastAsia="Times New Roman"/>
+          <w:b w:val="0"/>
+        </w:rPr>
+        <w:t xml:space="preserve">, SharePoint and Azure OpenAI; pitched a 9-month pilot roadmap to KAM leadership, projected to cut account planning from </w:t>
+      </w:r>
+      <w:r>
+        <w:rPr>
+          <w:rFonts w:eastAsia="Times New Roman"/>
+          <w:b/>
+        </w:rPr>
+        <w:t>2–5 days to under 1 day</w:t>
+      </w:r>
+      <w:r>
+        <w:rPr>
+          <w:rFonts w:eastAsia="Times New Roman"/>
+          <w:b w:val="0"/>
+        </w:rPr>
+        <w:t>.</w:t>
       </w:r>
     </w:p>
     <w:p>

</xml_diff>